<commit_message>
more problems and idea propostion
</commit_message>
<xml_diff>
--- a/Problems in V3 and new functionality proposition.docx
+++ b/Problems in V3 and new functionality proposition.docx
@@ -18,28 +18,17 @@
           <w:sz w:val="32"/>
           <w:szCs w:val="32"/>
         </w:rPr>
-        <w:t xml:space="preserve">Problems in V3 according to </w:t>
-      </w:r>
-      <w:proofErr w:type="spellStart"/>
-      <w:r>
+        <w:t>Problems in V3 according to claude</w:t>
+      </w:r>
+    </w:p>
+    <w:p>
+      <w:pPr>
         <w:rPr>
           <w:b/>
           <w:bCs/>
           <w:sz w:val="32"/>
           <w:szCs w:val="32"/>
         </w:rPr>
-        <w:t>claude</w:t>
-      </w:r>
-      <w:proofErr w:type="spellEnd"/>
-    </w:p>
-    <w:p>
-      <w:pPr>
-        <w:rPr>
-          <w:b/>
-          <w:bCs/>
-          <w:sz w:val="32"/>
-          <w:szCs w:val="32"/>
-        </w:rPr>
       </w:pPr>
     </w:p>
     <w:p>
@@ -82,35 +71,7 @@
         <w:rPr>
           <w:szCs w:val="24"/>
         </w:rPr>
-        <w:t xml:space="preserve">Confirmed fixed: all five previously uncited references ([13], [16], [28], [30], [41]) are now genuinely integrated, not just dropped in for a citation count — the McBain et al. stat opens your Introduction with real force, and the </w:t>
-      </w:r>
-      <w:proofErr w:type="spellStart"/>
-      <w:r>
-        <w:rPr>
-          <w:szCs w:val="24"/>
-        </w:rPr>
-        <w:t>Herpertz</w:t>
-      </w:r>
-      <w:proofErr w:type="spellEnd"/>
-      <w:r>
-        <w:rPr>
-          <w:szCs w:val="24"/>
-        </w:rPr>
-        <w:t xml:space="preserve"> et al. FDA device-lineage citation adds actual teeth to Section 4.4 instead of just gesturing at "future regulatory engagement." The Digital Wellbeing reframing, the keystroke-capture honesty in 3.2, and the </w:t>
-      </w:r>
-      <w:proofErr w:type="spellStart"/>
-      <w:r>
-        <w:rPr>
-          <w:szCs w:val="24"/>
-        </w:rPr>
-        <w:t>MindGuard</w:t>
-      </w:r>
-      <w:proofErr w:type="spellEnd"/>
-      <w:r>
-        <w:rPr>
-          <w:szCs w:val="24"/>
-        </w:rPr>
-        <w:t xml:space="preserve"> integration in 3.6 are all exactly the substance I'd hoped for — 3.6 in particular is genuinely well done: it scopes the classifier correctly, explicitly closes off the ambient-capture reading, and names its own open question (Tele MANAS routing for harm-to-others) instead of quietly assuming it away.</w:t>
+        <w:t>Confirmed fixed: all five previously uncited references ([13], [16], [28], [30], [41]) are now genuinely integrated, not just dropped in for a citation count — the McBain et al. stat opens your Introduction with real force, and the Herpertz et al. FDA device-lineage citation adds actual teeth to Section 4.4 instead of just gesturing at "future regulatory engagement." The Digital Wellbeing reframing, the keystroke-capture honesty in 3.2, and the MindGuard integration in 3.6 are all exactly the substance I'd hoped for — 3.6 in particular is genuinely well done: it scopes the classifier correctly, explicitly closes off the ambient-capture reading, and names its own open question (Tele MANAS routing for harm-to-others) instead of quietly assuming it away.</w:t>
       </w:r>
     </w:p>
     <w:p>
@@ -140,21 +101,7 @@
         <w:rPr>
           <w:szCs w:val="24"/>
         </w:rPr>
-        <w:t xml:space="preserve">McBain et al. 2026, JAMA </w:t>
-      </w:r>
-      <w:proofErr w:type="spellStart"/>
-      <w:r>
-        <w:rPr>
-          <w:szCs w:val="24"/>
-        </w:rPr>
-        <w:t>Pediatrics</w:t>
-      </w:r>
-      <w:proofErr w:type="spellEnd"/>
-      <w:r>
-        <w:rPr>
-          <w:szCs w:val="24"/>
-        </w:rPr>
-        <w:t xml:space="preserve">: 19.2% (not just "nearly one in five" — that's a precise match) and 63.3% non-disclosure ("63%" </w:t>
+        <w:t xml:space="preserve">McBain et al. 2026, JAMA Pediatrics: 19.2% (not just "nearly one in five" — that's a precise match) and 63.3% non-disclosure ("63%" </w:t>
       </w:r>
       <w:r>
         <w:rPr>
@@ -180,33 +127,11 @@
           <w:szCs w:val="24"/>
         </w:rPr>
       </w:pPr>
-      <w:proofErr w:type="spellStart"/>
-      <w:r>
-        <w:rPr>
-          <w:szCs w:val="24"/>
-        </w:rPr>
-        <w:t>ModernBERT</w:t>
-      </w:r>
-      <w:proofErr w:type="spellEnd"/>
-      <w:r>
-        <w:rPr>
-          <w:szCs w:val="24"/>
-        </w:rPr>
-        <w:t xml:space="preserve"> base = 149M params, confirmed against the original paper and </w:t>
-      </w:r>
-      <w:proofErr w:type="spellStart"/>
-      <w:r>
-        <w:rPr>
-          <w:szCs w:val="24"/>
-        </w:rPr>
-        <w:t>HuggingFace</w:t>
-      </w:r>
-      <w:proofErr w:type="spellEnd"/>
-      <w:r>
-        <w:rPr>
-          <w:szCs w:val="24"/>
-        </w:rPr>
-        <w:t xml:space="preserve"> release. Exact.</w:t>
+      <w:r>
+        <w:rPr>
+          <w:szCs w:val="24"/>
+        </w:rPr>
+        <w:t>ModernBERT base = 149M params, confirmed against the original paper and HuggingFace release. Exact.</w:t>
       </w:r>
     </w:p>
     <w:p>
@@ -219,33 +144,11 @@
           <w:szCs w:val="24"/>
         </w:rPr>
       </w:pPr>
-      <w:proofErr w:type="spellStart"/>
-      <w:r>
-        <w:rPr>
-          <w:szCs w:val="24"/>
-        </w:rPr>
-        <w:t>Herpertz</w:t>
-      </w:r>
-      <w:proofErr w:type="spellEnd"/>
-      <w:r>
-        <w:rPr>
-          <w:szCs w:val="24"/>
-        </w:rPr>
-        <w:t xml:space="preserve"> et al. 2025, </w:t>
-      </w:r>
-      <w:proofErr w:type="spellStart"/>
-      <w:r>
-        <w:rPr>
-          <w:szCs w:val="24"/>
-        </w:rPr>
-        <w:t>npj</w:t>
-      </w:r>
-      <w:proofErr w:type="spellEnd"/>
-      <w:r>
-        <w:rPr>
-          <w:szCs w:val="24"/>
-        </w:rPr>
-        <w:t xml:space="preserve"> Mental Health Research: confirmed — "many 510(k)-cleared devices lacked direct evidence of effectiveness, relying solely on equivalence to predicate devices," and four (you say "several," fair) authorized products whose pivotal trials used a different platform than what shipped. Exact.</w:t>
+      <w:r>
+        <w:rPr>
+          <w:szCs w:val="24"/>
+        </w:rPr>
+        <w:t>Herpertz et al. 2025, npj Mental Health Research: confirmed — "many 510(k)-cleared devices lacked direct evidence of effectiveness, relying solely on equivalence to predicate devices," and four (you say "several," fair) authorized products whose pivotal trials used a different platform than what shipped. Exact.</w:t>
       </w:r>
     </w:p>
     <w:p>
@@ -284,85 +187,19 @@
           <w:szCs w:val="24"/>
         </w:rPr>
       </w:pPr>
-      <w:proofErr w:type="spellStart"/>
-      <w:r>
-        <w:rPr>
-          <w:b/>
-          <w:bCs/>
-          <w:szCs w:val="24"/>
-        </w:rPr>
-        <w:t>ProMind</w:t>
-      </w:r>
-      <w:proofErr w:type="spellEnd"/>
-      <w:r>
-        <w:rPr>
-          <w:b/>
-          <w:bCs/>
-          <w:szCs w:val="24"/>
-        </w:rPr>
-        <w:t>-LLM is missing from Section 2.1,</w:t>
-      </w:r>
-      <w:r>
-        <w:rPr>
-          <w:szCs w:val="24"/>
-        </w:rPr>
-        <w:t xml:space="preserve"> and its absence is more conspicuous now than before. You cite </w:t>
-      </w:r>
-      <w:proofErr w:type="spellStart"/>
-      <w:r>
-        <w:rPr>
-          <w:szCs w:val="24"/>
-        </w:rPr>
-        <w:t>MindGuard</w:t>
-      </w:r>
-      <w:proofErr w:type="spellEnd"/>
-      <w:r>
-        <w:rPr>
-          <w:szCs w:val="24"/>
-        </w:rPr>
-        <w:t xml:space="preserve"> [57] in detail — but </w:t>
-      </w:r>
-      <w:proofErr w:type="spellStart"/>
-      <w:r>
-        <w:rPr>
-          <w:szCs w:val="24"/>
-        </w:rPr>
-        <w:t>ProMind</w:t>
-      </w:r>
-      <w:proofErr w:type="spellEnd"/>
-      <w:r>
-        <w:rPr>
-          <w:szCs w:val="24"/>
-        </w:rPr>
-        <w:t xml:space="preserve">-LLM is </w:t>
-      </w:r>
-      <w:proofErr w:type="spellStart"/>
-      <w:r>
-        <w:rPr>
-          <w:szCs w:val="24"/>
-        </w:rPr>
-        <w:t>MindGuard's</w:t>
-      </w:r>
-      <w:proofErr w:type="spellEnd"/>
-      <w:r>
-        <w:rPr>
-          <w:szCs w:val="24"/>
-        </w:rPr>
-        <w:t xml:space="preserve"> own direct successor, same lab, same authors, and it's the more methodologically sophisticated of the two (better </w:t>
-      </w:r>
-      <w:proofErr w:type="spellStart"/>
-      <w:r>
-        <w:rPr>
-          <w:szCs w:val="24"/>
-        </w:rPr>
-        <w:t>labeling</w:t>
-      </w:r>
-      <w:proofErr w:type="spellEnd"/>
-      <w:r>
-        <w:rPr>
-          <w:szCs w:val="24"/>
-        </w:rPr>
-        <w:t xml:space="preserve"> via licensed psychologists, causal reasoning). A reviewer who knows this space will notice you engaged with the earlier paper but not its own follow-up. Worth a sentence at minimum.</w:t>
+      <w:r>
+        <w:rPr>
+          <w:b/>
+          <w:bCs/>
+          <w:szCs w:val="24"/>
+        </w:rPr>
+        <w:t>ProMind-LLM is missing from Section 2.1,</w:t>
+      </w:r>
+      <w:r>
+        <w:rPr>
+          <w:szCs w:val="24"/>
+        </w:rPr>
+        <w:t xml:space="preserve"> and its absence is more conspicuous now than before. You cite MindGuard [57] in detail — but ProMind-LLM is MindGuard's own direct successor, same lab, same authors, and it's the more methodologically sophisticated of the two (better labeling via licensed psychologists, causal reasoning). A reviewer who knows this space will notice you engaged with the earlier paper but not its own follow-up. Worth a sentence at minimum.</w:t>
       </w:r>
     </w:p>
     <w:p>
@@ -525,21 +362,7 @@
         <w:rPr>
           <w:szCs w:val="24"/>
         </w:rPr>
-        <w:t xml:space="preserve">Small holdover from before: Section 2.4 still glosses </w:t>
-      </w:r>
-      <w:proofErr w:type="spellStart"/>
-      <w:r>
-        <w:rPr>
-          <w:szCs w:val="24"/>
-        </w:rPr>
-        <w:t>ProKnow's</w:t>
-      </w:r>
-      <w:proofErr w:type="spellEnd"/>
-      <w:r>
-        <w:rPr>
-          <w:szCs w:val="24"/>
-        </w:rPr>
-        <w:t xml:space="preserve"> "96% reduction" as a "knowledge-capture-violation metric" rather than their actual term (averaged squared rank error). Genuinely minor, easy fix.</w:t>
+        <w:t>Small holdover from before: Section 2.4 still glosses ProKnow's "96% reduction" as a "knowledge-capture-violation metric" rather than their actual term (averaged squared rank error). Genuinely minor, easy fix.</w:t>
       </w:r>
     </w:p>
     <w:p>
@@ -701,26 +524,28 @@
           <w:sz w:val="28"/>
           <w:szCs w:val="28"/>
         </w:rPr>
-        <w:t xml:space="preserve"> academic records, </w:t>
-      </w:r>
-      <w:r>
+        <w:t xml:space="preserve"> academic records, career pressure, peer pressure , current working/financial conditions(this feature for all) ,into account for estimation of mental health condition.</w:t>
+      </w:r>
+    </w:p>
+    <w:p>
+      <w:pPr>
         <w:rPr>
           <w:b/>
           <w:bCs/>
           <w:sz w:val="28"/>
           <w:szCs w:val="28"/>
         </w:rPr>
-        <w:t>career pressure, peer</w:t>
-      </w:r>
-      <w:r>
+      </w:pPr>
+    </w:p>
+    <w:p>
+      <w:pPr>
         <w:rPr>
           <w:b/>
           <w:bCs/>
           <w:sz w:val="28"/>
           <w:szCs w:val="28"/>
         </w:rPr>
-        <w:t xml:space="preserve"> pressure , current working/financial conditions(this feature for all) ,into account for estimation of mental health condition.</w:t>
-      </w:r>
+      </w:pPr>
     </w:p>
     <w:p>
       <w:pPr>
@@ -731,33 +556,13 @@
           <w:szCs w:val="28"/>
         </w:rPr>
       </w:pPr>
-    </w:p>
-    <w:p>
-      <w:pPr>
+      <w:r>
         <w:rPr>
           <w:b/>
           <w:bCs/>
           <w:sz w:val="28"/>
           <w:szCs w:val="28"/>
         </w:rPr>
-      </w:pPr>
-    </w:p>
-    <w:p>
-      <w:pPr>
-        <w:rPr>
-          <w:b/>
-          <w:bCs/>
-          <w:sz w:val="28"/>
-          <w:szCs w:val="28"/>
-        </w:rPr>
-      </w:pPr>
-      <w:r>
-        <w:rPr>
-          <w:b/>
-          <w:bCs/>
-          <w:sz w:val="28"/>
-          <w:szCs w:val="28"/>
-        </w:rPr>
         <w:t>The two proposed additions</w:t>
       </w:r>
     </w:p>
@@ -841,21 +646,7 @@
         <w:rPr>
           <w:szCs w:val="24"/>
         </w:rPr>
-        <w:t xml:space="preserve">, not-necessarily-user-initiated escalation path — that's a different and much riskier proposal, and here's real evidence for why, not just my own caution. I looked into how "flag a student to their institution" has actually gone in practice: there's a documented pattern of students who sought </w:t>
-      </w:r>
-      <w:proofErr w:type="spellStart"/>
-      <w:r>
-        <w:rPr>
-          <w:szCs w:val="24"/>
-        </w:rPr>
-        <w:t>counseling</w:t>
-      </w:r>
-      <w:proofErr w:type="spellEnd"/>
-      <w:r>
-        <w:rPr>
-          <w:szCs w:val="24"/>
-        </w:rPr>
-        <w:t xml:space="preserve"> for non-suicidal reasons being placed on involuntary medical leave, in some cases barred from campus entirely — a University of Chicago student held for two weeks with, by her account, no suicidal intent; a Quinnipiac University case that ended in an ADA Title III discrimination settlement after a student was put on mandatory leave following her </w:t>
+        <w:t xml:space="preserve">, not-necessarily-user-initiated escalation path — that's a different and much riskier proposal, and here's real evidence for why, not just my own caution. I looked into how "flag a student to their institution" has actually gone in practice: there's a documented pattern of students who sought counseling for non-suicidal reasons being placed on involuntary medical leave, in some cases barred from campus entirely — a University of Chicago student held for two weeks with, by her account, no suicidal intent; a Quinnipiac University case that ended in an ADA Title III discrimination settlement after a student was put on mandatory leave following her </w:t>
       </w:r>
       <w:r>
         <w:rPr>
@@ -869,21 +660,7 @@
         <w:rPr>
           <w:szCs w:val="24"/>
         </w:rPr>
-        <w:t xml:space="preserve"> </w:t>
-      </w:r>
-      <w:proofErr w:type="spellStart"/>
-      <w:r>
-        <w:rPr>
-          <w:szCs w:val="24"/>
-        </w:rPr>
-        <w:t>counseling</w:t>
-      </w:r>
-      <w:proofErr w:type="spellEnd"/>
-      <w:r>
-        <w:rPr>
-          <w:szCs w:val="24"/>
-        </w:rPr>
-        <w:t xml:space="preserve"> visit; a similar lawsuit at Stanford. This isn't a fringe concern — it's litigated, legally recognized territory. An institution is not a neutral, purely-therapeutic party the way Tele MANAS is; it has disciplinary authority, academic-standing power, and its own liability incentives, and those can point in a very different direction than "get this student support." Tele MANAS earns its place in your design specifically </w:t>
+        <w:t xml:space="preserve"> counseling visit; a similar lawsuit at Stanford. This isn't a fringe concern — it's litigated, legally recognized territory. An institution is not a neutral, purely-therapeutic party the way Tele MANAS is; it has disciplinary authority, academic-standing power, and its own liability incentives, and those can point in a very different direction than "get this student support." Tele MANAS earns its place in your design specifically </w:t>
       </w:r>
       <w:r>
         <w:rPr>
@@ -986,49 +763,7 @@
         <w:rPr>
           <w:szCs w:val="24"/>
         </w:rPr>
-        <w:t xml:space="preserve">Academic records live on someone else's server. Grades and academic standing sit in an institution's student information system, not on the phone. Pulling them in means establishing a data-sharing relationship between the institution and Sentinel — which directly contradicts the "sole party with access to their own </w:t>
-      </w:r>
-      <w:proofErr w:type="spellStart"/>
-      <w:r>
-        <w:rPr>
-          <w:szCs w:val="24"/>
-        </w:rPr>
-        <w:t>behavioral</w:t>
-      </w:r>
-      <w:proofErr w:type="spellEnd"/>
-      <w:r>
-        <w:rPr>
-          <w:szCs w:val="24"/>
-        </w:rPr>
-        <w:t xml:space="preserve"> data" claim that's your central differentiator from </w:t>
-      </w:r>
-      <w:proofErr w:type="spellStart"/>
-      <w:r>
-        <w:rPr>
-          <w:szCs w:val="24"/>
-        </w:rPr>
-        <w:t>Beiwe</w:t>
-      </w:r>
-      <w:proofErr w:type="spellEnd"/>
-      <w:r>
-        <w:rPr>
-          <w:szCs w:val="24"/>
-        </w:rPr>
-        <w:t xml:space="preserve"> and </w:t>
-      </w:r>
-      <w:proofErr w:type="spellStart"/>
-      <w:r>
-        <w:rPr>
-          <w:szCs w:val="24"/>
-        </w:rPr>
-        <w:t>mindLAMP</w:t>
-      </w:r>
-      <w:proofErr w:type="spellEnd"/>
-      <w:r>
-        <w:rPr>
-          <w:szCs w:val="24"/>
-        </w:rPr>
-        <w:t xml:space="preserve"> in Section 2.1. You've spent three revisions making the zero-knowledge boundary airtight for phone-native signals; this reopens exactly the door that boundary was built to close, from a different direction.</w:t>
+        <w:t>Academic records live on someone else's server. Grades and academic standing sit in an institution's student information system, not on the phone. Pulling them in means establishing a data-sharing relationship between the institution and Sentinel — which directly contradicts the "sole party with access to their own behavioral data" claim that's your central differentiator from Beiwe and mindLAMP in Section 2.1. You've spent three revisions making the zero-knowledge boundary airtight for phone-native signals; this reopens exactly the door that boundary was built to close, from a different direction.</w:t>
       </w:r>
     </w:p>
     <w:p>
@@ -1045,21 +780,7 @@
         <w:rPr>
           <w:szCs w:val="24"/>
         </w:rPr>
-        <w:t xml:space="preserve">There's no PHQ-9 for "peer pressure." Your generation layer's entire safety argument rests on RAG-grounding every output in a validated clinical instrument (Section 3.3, citing </w:t>
-      </w:r>
-      <w:proofErr w:type="spellStart"/>
-      <w:r>
-        <w:rPr>
-          <w:szCs w:val="24"/>
-        </w:rPr>
-        <w:t>ProKnow</w:t>
-      </w:r>
-      <w:proofErr w:type="spellEnd"/>
-      <w:r>
-        <w:rPr>
-          <w:szCs w:val="24"/>
-        </w:rPr>
-        <w:t>). Depression and anxiety have that instrument. Financial stress has an undergraduate-specific scale that exists but isn't remotely as universally recognized. "Career pressure" and "peer pressure" don't have anything close to PHQ-9's standing. Feeding ungrounded constructs into the same pipeline you built specifically to avoid ungrounded generation would be inconsistent with your own Section 2.4 argument.</w:t>
+        <w:t>There's no PHQ-9 for "peer pressure." Your generation layer's entire safety argument rests on RAG-grounding every output in a validated clinical instrument (Section 3.3, citing ProKnow). Depression and anxiety have that instrument. Financial stress has an undergraduate-specific scale that exists but isn't remotely as universally recognized. "Career pressure" and "peer pressure" don't have anything close to PHQ-9's standing. Feeding ungrounded constructs into the same pipeline you built specifically to avoid ungrounded generation would be inconsistent with your own Section 2.4 argument.</w:t>
       </w:r>
     </w:p>
     <w:p>
@@ -1113,7 +834,87 @@
     <w:p>
       <w:pPr>
         <w:rPr>
-          <w:szCs w:val="24"/>
+          <w:b/>
+          <w:bCs/>
+          <w:sz w:val="28"/>
+          <w:szCs w:val="28"/>
+        </w:rPr>
+      </w:pPr>
+      <w:r>
+        <w:rPr>
+          <w:b/>
+          <w:bCs/>
+          <w:sz w:val="28"/>
+          <w:szCs w:val="28"/>
+        </w:rPr>
+        <w:t>Solution or By Path for two propositions</w:t>
+      </w:r>
+      <w:r>
+        <w:rPr>
+          <w:b/>
+          <w:bCs/>
+          <w:sz w:val="28"/>
+          <w:szCs w:val="28"/>
+        </w:rPr>
+        <w:t xml:space="preserve"> Currently just thinking</w:t>
+      </w:r>
+    </w:p>
+    <w:p>
+      <w:pPr>
+        <w:rPr>
+          <w:szCs w:val="24"/>
+        </w:rPr>
+      </w:pPr>
+      <w:r>
+        <w:rPr>
+          <w:szCs w:val="24"/>
+        </w:rPr>
+        <w:t xml:space="preserve">those basics problems </w:t>
+      </w:r>
+      <w:r>
+        <w:rPr>
+          <w:szCs w:val="24"/>
+        </w:rPr>
+        <w:t xml:space="preserve">I </w:t>
+      </w:r>
+      <w:r>
+        <w:rPr>
+          <w:szCs w:val="24"/>
+        </w:rPr>
+        <w:t>can fix , now think and talk about my two proposed additions , first one is decent</w:t>
+      </w:r>
+      <w:r>
+        <w:rPr>
+          <w:szCs w:val="24"/>
+        </w:rPr>
+        <w:t xml:space="preserve"> I</w:t>
+      </w:r>
+      <w:r>
+        <w:rPr>
+          <w:szCs w:val="24"/>
+        </w:rPr>
+        <w:t xml:space="preserve"> can use this by side with </w:t>
+      </w:r>
+      <w:r>
+        <w:rPr>
+          <w:szCs w:val="24"/>
+        </w:rPr>
+        <w:t>TELEMANAS</w:t>
+      </w:r>
+      <w:r>
+        <w:rPr>
+          <w:szCs w:val="24"/>
+        </w:rPr>
+        <w:t xml:space="preserve"> as research paper says an automated feature of adding a best friend contact details and calling it when needed and before calling sending an automated message describing problem and whole situation . now the second of academic performance ,career pressure etc. for those i can work on academic stress ( i would provide a feature of uploading marks academic grades achievements etc in which user is comfortable) if user uploads than I can use that data also to get know about users condition make better estimate and provide better solution( from this i got an idea that in the message to friend or anyone I could also add the solutions which could be done to sooth the user as user is more close to contact, this will work better than TELEMANAS) and for financial and peer pressure standards I for now can't do much what can I do is — the user types "money's been tight this semester" , "placement needed soon " etc statements that would be gathered from keyboard of user or when user interacting with LLM for help , alongside the structured summary, never touching the automated detection or generation pipeline. That sidesteps all two problems: no institutional data pipeline (self-entered, on-device, optional), no self-report-replacing-passive-sensing claim (it's supplementary context for a human, not a machine-learning input), and no need for a validated instrument (a trained counsellor is interpreting it, not an algorithm). It's a smaller feature than what you described, but it's one that doesn't cost you the coherence you've built.</w:t>
+      </w:r>
+    </w:p>
+    <w:p>
+      <w:pPr>
+        <w:rPr>
+          <w:b/>
+          <w:bCs/>
+          <w:sz w:val="28"/>
+          <w:szCs w:val="28"/>
         </w:rPr>
       </w:pPr>
     </w:p>

</xml_diff>

<commit_message>
NEW functionality/feature research done(v4will ummm)
</commit_message>
<xml_diff>
--- a/Problems in V3 and new functionality proposition.docx
+++ b/Problems in V3 and new functionality proposition.docx
@@ -11,6 +11,7 @@
           <w:szCs w:val="32"/>
         </w:rPr>
       </w:pPr>
+      <w:proofErr w:type="spellStart"/>
       <w:r>
         <w:rPr>
           <w:b/>
@@ -18,17 +19,47 @@
           <w:sz w:val="32"/>
           <w:szCs w:val="32"/>
         </w:rPr>
-        <w:t>Problems in V3 according to claude</w:t>
-      </w:r>
-    </w:p>
-    <w:p>
-      <w:pPr>
+        <w:t>o</w:t>
+      </w:r>
+      <w:r>
         <w:rPr>
           <w:b/>
           <w:bCs/>
           <w:sz w:val="32"/>
           <w:szCs w:val="32"/>
         </w:rPr>
+        <w:t>Problems</w:t>
+      </w:r>
+      <w:proofErr w:type="spellEnd"/>
+      <w:r>
+        <w:rPr>
+          <w:b/>
+          <w:bCs/>
+          <w:sz w:val="32"/>
+          <w:szCs w:val="32"/>
+        </w:rPr>
+        <w:t xml:space="preserve"> in V3 according to </w:t>
+      </w:r>
+      <w:proofErr w:type="spellStart"/>
+      <w:r>
+        <w:rPr>
+          <w:b/>
+          <w:bCs/>
+          <w:sz w:val="32"/>
+          <w:szCs w:val="32"/>
+        </w:rPr>
+        <w:t>claude</w:t>
+      </w:r>
+      <w:proofErr w:type="spellEnd"/>
+    </w:p>
+    <w:p>
+      <w:pPr>
+        <w:rPr>
+          <w:b/>
+          <w:bCs/>
+          <w:sz w:val="32"/>
+          <w:szCs w:val="32"/>
+        </w:rPr>
       </w:pPr>
     </w:p>
     <w:p>
@@ -71,7 +102,35 @@
         <w:rPr>
           <w:szCs w:val="24"/>
         </w:rPr>
-        <w:t>Confirmed fixed: all five previously uncited references ([13], [16], [28], [30], [41]) are now genuinely integrated, not just dropped in for a citation count — the McBain et al. stat opens your Introduction with real force, and the Herpertz et al. FDA device-lineage citation adds actual teeth to Section 4.4 instead of just gesturing at "future regulatory engagement." The Digital Wellbeing reframing, the keystroke-capture honesty in 3.2, and the MindGuard integration in 3.6 are all exactly the substance I'd hoped for — 3.6 in particular is genuinely well done: it scopes the classifier correctly, explicitly closes off the ambient-capture reading, and names its own open question (Tele MANAS routing for harm-to-others) instead of quietly assuming it away.</w:t>
+        <w:t xml:space="preserve">Confirmed fixed: all five previously uncited references ([13], [16], [28], [30], [41]) are now genuinely integrated, not just dropped in for a citation count — the McBain et al. stat opens your Introduction with real force, and the </w:t>
+      </w:r>
+      <w:proofErr w:type="spellStart"/>
+      <w:r>
+        <w:rPr>
+          <w:szCs w:val="24"/>
+        </w:rPr>
+        <w:t>Herpertz</w:t>
+      </w:r>
+      <w:proofErr w:type="spellEnd"/>
+      <w:r>
+        <w:rPr>
+          <w:szCs w:val="24"/>
+        </w:rPr>
+        <w:t xml:space="preserve"> et al. FDA device-lineage citation adds actual teeth to Section 4.4 instead of just gesturing at "future regulatory engagement." The Digital Wellbeing reframing, the keystroke-capture honesty in 3.2, and the </w:t>
+      </w:r>
+      <w:proofErr w:type="spellStart"/>
+      <w:r>
+        <w:rPr>
+          <w:szCs w:val="24"/>
+        </w:rPr>
+        <w:t>MindGuard</w:t>
+      </w:r>
+      <w:proofErr w:type="spellEnd"/>
+      <w:r>
+        <w:rPr>
+          <w:szCs w:val="24"/>
+        </w:rPr>
+        <w:t xml:space="preserve"> integration in 3.6 are all exactly the substance I'd hoped for — 3.6 in particular is genuinely well done: it scopes the classifier correctly, explicitly closes off the ambient-capture reading, and names its own open question (Tele MANAS routing for harm-to-others) instead of quietly assuming it away.</w:t>
       </w:r>
     </w:p>
     <w:p>
@@ -101,7 +160,21 @@
         <w:rPr>
           <w:szCs w:val="24"/>
         </w:rPr>
-        <w:t xml:space="preserve">McBain et al. 2026, JAMA Pediatrics: 19.2% (not just "nearly one in five" — that's a precise match) and 63.3% non-disclosure ("63%" </w:t>
+        <w:t xml:space="preserve">McBain et al. 2026, JAMA </w:t>
+      </w:r>
+      <w:proofErr w:type="spellStart"/>
+      <w:r>
+        <w:rPr>
+          <w:szCs w:val="24"/>
+        </w:rPr>
+        <w:t>Pediatrics</w:t>
+      </w:r>
+      <w:proofErr w:type="spellEnd"/>
+      <w:r>
+        <w:rPr>
+          <w:szCs w:val="24"/>
+        </w:rPr>
+        <w:t xml:space="preserve">: 19.2% (not just "nearly one in five" — that's a precise match) and 63.3% non-disclosure ("63%" </w:t>
       </w:r>
       <w:r>
         <w:rPr>
@@ -127,11 +200,33 @@
           <w:szCs w:val="24"/>
         </w:rPr>
       </w:pPr>
-      <w:r>
-        <w:rPr>
-          <w:szCs w:val="24"/>
-        </w:rPr>
-        <w:t>ModernBERT base = 149M params, confirmed against the original paper and HuggingFace release. Exact.</w:t>
+      <w:proofErr w:type="spellStart"/>
+      <w:r>
+        <w:rPr>
+          <w:szCs w:val="24"/>
+        </w:rPr>
+        <w:t>ModernBERT</w:t>
+      </w:r>
+      <w:proofErr w:type="spellEnd"/>
+      <w:r>
+        <w:rPr>
+          <w:szCs w:val="24"/>
+        </w:rPr>
+        <w:t xml:space="preserve"> base = 149M params, confirmed against the original paper and </w:t>
+      </w:r>
+      <w:proofErr w:type="spellStart"/>
+      <w:r>
+        <w:rPr>
+          <w:szCs w:val="24"/>
+        </w:rPr>
+        <w:t>HuggingFace</w:t>
+      </w:r>
+      <w:proofErr w:type="spellEnd"/>
+      <w:r>
+        <w:rPr>
+          <w:szCs w:val="24"/>
+        </w:rPr>
+        <w:t xml:space="preserve"> release. Exact.</w:t>
       </w:r>
     </w:p>
     <w:p>
@@ -144,11 +239,33 @@
           <w:szCs w:val="24"/>
         </w:rPr>
       </w:pPr>
-      <w:r>
-        <w:rPr>
-          <w:szCs w:val="24"/>
-        </w:rPr>
-        <w:t>Herpertz et al. 2025, npj Mental Health Research: confirmed — "many 510(k)-cleared devices lacked direct evidence of effectiveness, relying solely on equivalence to predicate devices," and four (you say "several," fair) authorized products whose pivotal trials used a different platform than what shipped. Exact.</w:t>
+      <w:proofErr w:type="spellStart"/>
+      <w:r>
+        <w:rPr>
+          <w:szCs w:val="24"/>
+        </w:rPr>
+        <w:t>Herpertz</w:t>
+      </w:r>
+      <w:proofErr w:type="spellEnd"/>
+      <w:r>
+        <w:rPr>
+          <w:szCs w:val="24"/>
+        </w:rPr>
+        <w:t xml:space="preserve"> et al. 2025, </w:t>
+      </w:r>
+      <w:proofErr w:type="spellStart"/>
+      <w:r>
+        <w:rPr>
+          <w:szCs w:val="24"/>
+        </w:rPr>
+        <w:t>npj</w:t>
+      </w:r>
+      <w:proofErr w:type="spellEnd"/>
+      <w:r>
+        <w:rPr>
+          <w:szCs w:val="24"/>
+        </w:rPr>
+        <w:t xml:space="preserve"> Mental Health Research: confirmed — "many 510(k)-cleared devices lacked direct evidence of effectiveness, relying solely on equivalence to predicate devices," and four (you say "several," fair) authorized products whose pivotal trials used a different platform than what shipped. Exact.</w:t>
       </w:r>
     </w:p>
     <w:p>
@@ -187,19 +304,85 @@
           <w:szCs w:val="24"/>
         </w:rPr>
       </w:pPr>
-      <w:r>
-        <w:rPr>
-          <w:b/>
-          <w:bCs/>
-          <w:szCs w:val="24"/>
-        </w:rPr>
-        <w:t>ProMind-LLM is missing from Section 2.1,</w:t>
-      </w:r>
-      <w:r>
-        <w:rPr>
-          <w:szCs w:val="24"/>
-        </w:rPr>
-        <w:t xml:space="preserve"> and its absence is more conspicuous now than before. You cite MindGuard [57] in detail — but ProMind-LLM is MindGuard's own direct successor, same lab, same authors, and it's the more methodologically sophisticated of the two (better labeling via licensed psychologists, causal reasoning). A reviewer who knows this space will notice you engaged with the earlier paper but not its own follow-up. Worth a sentence at minimum.</w:t>
+      <w:proofErr w:type="spellStart"/>
+      <w:r>
+        <w:rPr>
+          <w:b/>
+          <w:bCs/>
+          <w:szCs w:val="24"/>
+        </w:rPr>
+        <w:t>ProMind</w:t>
+      </w:r>
+      <w:proofErr w:type="spellEnd"/>
+      <w:r>
+        <w:rPr>
+          <w:b/>
+          <w:bCs/>
+          <w:szCs w:val="24"/>
+        </w:rPr>
+        <w:t>-LLM is missing from Section 2.1,</w:t>
+      </w:r>
+      <w:r>
+        <w:rPr>
+          <w:szCs w:val="24"/>
+        </w:rPr>
+        <w:t xml:space="preserve"> and its absence is more conspicuous now than before. You cite </w:t>
+      </w:r>
+      <w:proofErr w:type="spellStart"/>
+      <w:r>
+        <w:rPr>
+          <w:szCs w:val="24"/>
+        </w:rPr>
+        <w:t>MindGuard</w:t>
+      </w:r>
+      <w:proofErr w:type="spellEnd"/>
+      <w:r>
+        <w:rPr>
+          <w:szCs w:val="24"/>
+        </w:rPr>
+        <w:t xml:space="preserve"> [57] in detail — but </w:t>
+      </w:r>
+      <w:proofErr w:type="spellStart"/>
+      <w:r>
+        <w:rPr>
+          <w:szCs w:val="24"/>
+        </w:rPr>
+        <w:t>ProMind</w:t>
+      </w:r>
+      <w:proofErr w:type="spellEnd"/>
+      <w:r>
+        <w:rPr>
+          <w:szCs w:val="24"/>
+        </w:rPr>
+        <w:t xml:space="preserve">-LLM is </w:t>
+      </w:r>
+      <w:proofErr w:type="spellStart"/>
+      <w:r>
+        <w:rPr>
+          <w:szCs w:val="24"/>
+        </w:rPr>
+        <w:t>MindGuard's</w:t>
+      </w:r>
+      <w:proofErr w:type="spellEnd"/>
+      <w:r>
+        <w:rPr>
+          <w:szCs w:val="24"/>
+        </w:rPr>
+        <w:t xml:space="preserve"> own direct successor, same lab, same authors, and it's the more methodologically sophisticated of the two (better </w:t>
+      </w:r>
+      <w:proofErr w:type="spellStart"/>
+      <w:r>
+        <w:rPr>
+          <w:szCs w:val="24"/>
+        </w:rPr>
+        <w:t>labeling</w:t>
+      </w:r>
+      <w:proofErr w:type="spellEnd"/>
+      <w:r>
+        <w:rPr>
+          <w:szCs w:val="24"/>
+        </w:rPr>
+        <w:t xml:space="preserve"> via licensed psychologists, causal reasoning). A reviewer who knows this space will notice you engaged with the earlier paper but not its own follow-up. Worth a sentence at minimum.</w:t>
       </w:r>
     </w:p>
     <w:p>
@@ -261,7 +444,21 @@
         <w:rPr>
           <w:szCs w:val="24"/>
         </w:rPr>
-        <w:t xml:space="preserve"> harm to others will be just a classification used for better understanding of users mental health condition rather than spreading information of person being harmed.</w:t>
+        <w:t xml:space="preserve"> harm to others will be just a classification used for better understanding of </w:t>
+      </w:r>
+      <w:proofErr w:type="gramStart"/>
+      <w:r>
+        <w:rPr>
+          <w:szCs w:val="24"/>
+        </w:rPr>
+        <w:t>users</w:t>
+      </w:r>
+      <w:proofErr w:type="gramEnd"/>
+      <w:r>
+        <w:rPr>
+          <w:szCs w:val="24"/>
+        </w:rPr>
+        <w:t xml:space="preserve"> mental health condition rather than spreading information of person being harmed.</w:t>
       </w:r>
     </w:p>
     <w:p>
@@ -362,7 +559,21 @@
         <w:rPr>
           <w:szCs w:val="24"/>
         </w:rPr>
-        <w:t>Small holdover from before: Section 2.4 still glosses ProKnow's "96% reduction" as a "knowledge-capture-violation metric" rather than their actual term (averaged squared rank error). Genuinely minor, easy fix.</w:t>
+        <w:t xml:space="preserve">Small holdover from before: Section 2.4 still glosses </w:t>
+      </w:r>
+      <w:proofErr w:type="spellStart"/>
+      <w:r>
+        <w:rPr>
+          <w:szCs w:val="24"/>
+        </w:rPr>
+        <w:t>ProKnow's</w:t>
+      </w:r>
+      <w:proofErr w:type="spellEnd"/>
+      <w:r>
+        <w:rPr>
+          <w:szCs w:val="24"/>
+        </w:rPr>
+        <w:t xml:space="preserve"> "96% reduction" as a "knowledge-capture-violation metric" rather than their actual term (averaged squared rank error). Genuinely minor, easy fix.</w:t>
       </w:r>
     </w:p>
     <w:p>
@@ -504,7 +715,17 @@
           <w:sz w:val="28"/>
           <w:szCs w:val="28"/>
         </w:rPr>
-        <w:t>and adding parameters of grades,</w:t>
+        <w:t xml:space="preserve">and adding parameters of </w:t>
+      </w:r>
+      <w:proofErr w:type="gramStart"/>
+      <w:r>
+        <w:rPr>
+          <w:b/>
+          <w:bCs/>
+          <w:sz w:val="28"/>
+          <w:szCs w:val="28"/>
+        </w:rPr>
+        <w:t>grades,</w:t>
       </w:r>
       <w:r>
         <w:rPr>
@@ -524,38 +745,39 @@
           <w:sz w:val="28"/>
           <w:szCs w:val="28"/>
         </w:rPr>
-        <w:t xml:space="preserve"> academic records, career pressure, peer pressure , current working/financial conditions(this feature for all) ,into account for estimation of mental health condition.</w:t>
-      </w:r>
-    </w:p>
-    <w:p>
-      <w:pPr>
+        <w:t xml:space="preserve"> academic</w:t>
+      </w:r>
+      <w:proofErr w:type="gramEnd"/>
+      <w:r>
         <w:rPr>
           <w:b/>
           <w:bCs/>
           <w:sz w:val="28"/>
           <w:szCs w:val="28"/>
         </w:rPr>
-      </w:pPr>
-    </w:p>
-    <w:p>
-      <w:pPr>
+        <w:t xml:space="preserve"> records, career pressure, peer </w:t>
+      </w:r>
+      <w:proofErr w:type="gramStart"/>
+      <w:r>
         <w:rPr>
           <w:b/>
           <w:bCs/>
           <w:sz w:val="28"/>
           <w:szCs w:val="28"/>
         </w:rPr>
-      </w:pPr>
-    </w:p>
-    <w:p>
-      <w:pPr>
+        <w:t>pressure ,</w:t>
+      </w:r>
+      <w:proofErr w:type="gramEnd"/>
+      <w:r>
         <w:rPr>
           <w:b/>
           <w:bCs/>
           <w:sz w:val="28"/>
           <w:szCs w:val="28"/>
         </w:rPr>
-      </w:pPr>
+        <w:t xml:space="preserve"> current working/financial </w:t>
+      </w:r>
+      <w:proofErr w:type="gramStart"/>
       <w:r>
         <w:rPr>
           <w:b/>
@@ -563,6 +785,75 @@
           <w:sz w:val="28"/>
           <w:szCs w:val="28"/>
         </w:rPr>
+        <w:t>conditions(</w:t>
+      </w:r>
+      <w:proofErr w:type="gramEnd"/>
+      <w:r>
+        <w:rPr>
+          <w:b/>
+          <w:bCs/>
+          <w:sz w:val="28"/>
+          <w:szCs w:val="28"/>
+        </w:rPr>
+        <w:t>this feature for all</w:t>
+      </w:r>
+      <w:proofErr w:type="gramStart"/>
+      <w:r>
+        <w:rPr>
+          <w:b/>
+          <w:bCs/>
+          <w:sz w:val="28"/>
+          <w:szCs w:val="28"/>
+        </w:rPr>
+        <w:t>) ,into</w:t>
+      </w:r>
+      <w:proofErr w:type="gramEnd"/>
+      <w:r>
+        <w:rPr>
+          <w:b/>
+          <w:bCs/>
+          <w:sz w:val="28"/>
+          <w:szCs w:val="28"/>
+        </w:rPr>
+        <w:t xml:space="preserve"> account for estimation of mental health condition.</w:t>
+      </w:r>
+    </w:p>
+    <w:p>
+      <w:pPr>
+        <w:rPr>
+          <w:b/>
+          <w:bCs/>
+          <w:sz w:val="28"/>
+          <w:szCs w:val="28"/>
+        </w:rPr>
+      </w:pPr>
+    </w:p>
+    <w:p>
+      <w:pPr>
+        <w:rPr>
+          <w:b/>
+          <w:bCs/>
+          <w:sz w:val="28"/>
+          <w:szCs w:val="28"/>
+        </w:rPr>
+      </w:pPr>
+    </w:p>
+    <w:p>
+      <w:pPr>
+        <w:rPr>
+          <w:b/>
+          <w:bCs/>
+          <w:sz w:val="28"/>
+          <w:szCs w:val="28"/>
+        </w:rPr>
+      </w:pPr>
+      <w:r>
+        <w:rPr>
+          <w:b/>
+          <w:bCs/>
+          <w:sz w:val="28"/>
+          <w:szCs w:val="28"/>
+        </w:rPr>
         <w:t>The two proposed additions</w:t>
       </w:r>
     </w:p>
@@ -646,7 +937,21 @@
         <w:rPr>
           <w:szCs w:val="24"/>
         </w:rPr>
-        <w:t xml:space="preserve">, not-necessarily-user-initiated escalation path — that's a different and much riskier proposal, and here's real evidence for why, not just my own caution. I looked into how "flag a student to their institution" has actually gone in practice: there's a documented pattern of students who sought counseling for non-suicidal reasons being placed on involuntary medical leave, in some cases barred from campus entirely — a University of Chicago student held for two weeks with, by her account, no suicidal intent; a Quinnipiac University case that ended in an ADA Title III discrimination settlement after a student was put on mandatory leave following her </w:t>
+        <w:t xml:space="preserve">, not-necessarily-user-initiated escalation path — that's a different and much riskier proposal, and here's real evidence for why, not just my own caution. I looked into how "flag a student to their institution" has actually gone in practice: there's a documented pattern of students who sought </w:t>
+      </w:r>
+      <w:proofErr w:type="spellStart"/>
+      <w:r>
+        <w:rPr>
+          <w:szCs w:val="24"/>
+        </w:rPr>
+        <w:t>counseling</w:t>
+      </w:r>
+      <w:proofErr w:type="spellEnd"/>
+      <w:r>
+        <w:rPr>
+          <w:szCs w:val="24"/>
+        </w:rPr>
+        <w:t xml:space="preserve"> for non-suicidal reasons being placed on involuntary medical leave, in some cases barred from campus entirely — a University of Chicago student held for two weeks with, by her account, no suicidal intent; a Quinnipiac University case that ended in an ADA Title III discrimination settlement after a student was put on mandatory leave following her </w:t>
       </w:r>
       <w:r>
         <w:rPr>
@@ -660,7 +965,21 @@
         <w:rPr>
           <w:szCs w:val="24"/>
         </w:rPr>
-        <w:t xml:space="preserve"> counseling visit; a similar lawsuit at Stanford. This isn't a fringe concern — it's litigated, legally recognized territory. An institution is not a neutral, purely-therapeutic party the way Tele MANAS is; it has disciplinary authority, academic-standing power, and its own liability incentives, and those can point in a very different direction than "get this student support." Tele MANAS earns its place in your design specifically </w:t>
+        <w:t xml:space="preserve"> </w:t>
+      </w:r>
+      <w:proofErr w:type="spellStart"/>
+      <w:r>
+        <w:rPr>
+          <w:szCs w:val="24"/>
+        </w:rPr>
+        <w:t>counseling</w:t>
+      </w:r>
+      <w:proofErr w:type="spellEnd"/>
+      <w:r>
+        <w:rPr>
+          <w:szCs w:val="24"/>
+        </w:rPr>
+        <w:t xml:space="preserve"> visit; a similar lawsuit at Stanford. This isn't a fringe concern — it's litigated, legally recognized territory. An institution is not a neutral, purely-therapeutic party the way Tele MANAS is; it has disciplinary authority, academic-standing power, and its own liability incentives, and those can point in a very different direction than "get this student support." Tele MANAS earns its place in your design specifically </w:t>
       </w:r>
       <w:r>
         <w:rPr>
@@ -763,7 +1082,49 @@
         <w:rPr>
           <w:szCs w:val="24"/>
         </w:rPr>
-        <w:t>Academic records live on someone else's server. Grades and academic standing sit in an institution's student information system, not on the phone. Pulling them in means establishing a data-sharing relationship between the institution and Sentinel — which directly contradicts the "sole party with access to their own behavioral data" claim that's your central differentiator from Beiwe and mindLAMP in Section 2.1. You've spent three revisions making the zero-knowledge boundary airtight for phone-native signals; this reopens exactly the door that boundary was built to close, from a different direction.</w:t>
+        <w:t xml:space="preserve">Academic records live on someone else's server. Grades and academic standing sit in an institution's student information system, not on the phone. Pulling them in means establishing a data-sharing relationship between the institution and Sentinel — which directly contradicts the "sole party with access to their own </w:t>
+      </w:r>
+      <w:proofErr w:type="spellStart"/>
+      <w:r>
+        <w:rPr>
+          <w:szCs w:val="24"/>
+        </w:rPr>
+        <w:t>behavioral</w:t>
+      </w:r>
+      <w:proofErr w:type="spellEnd"/>
+      <w:r>
+        <w:rPr>
+          <w:szCs w:val="24"/>
+        </w:rPr>
+        <w:t xml:space="preserve"> data" claim that's your central differentiator from </w:t>
+      </w:r>
+      <w:proofErr w:type="spellStart"/>
+      <w:r>
+        <w:rPr>
+          <w:szCs w:val="24"/>
+        </w:rPr>
+        <w:t>Beiwe</w:t>
+      </w:r>
+      <w:proofErr w:type="spellEnd"/>
+      <w:r>
+        <w:rPr>
+          <w:szCs w:val="24"/>
+        </w:rPr>
+        <w:t xml:space="preserve"> and </w:t>
+      </w:r>
+      <w:proofErr w:type="spellStart"/>
+      <w:r>
+        <w:rPr>
+          <w:szCs w:val="24"/>
+        </w:rPr>
+        <w:t>mindLAMP</w:t>
+      </w:r>
+      <w:proofErr w:type="spellEnd"/>
+      <w:r>
+        <w:rPr>
+          <w:szCs w:val="24"/>
+        </w:rPr>
+        <w:t xml:space="preserve"> in Section 2.1. You've spent three revisions making the zero-knowledge boundary airtight for phone-native signals; this reopens exactly the door that boundary was built to close, from a different direction.</w:t>
       </w:r>
     </w:p>
     <w:p>
@@ -780,7 +1141,21 @@
         <w:rPr>
           <w:szCs w:val="24"/>
         </w:rPr>
-        <w:t>There's no PHQ-9 for "peer pressure." Your generation layer's entire safety argument rests on RAG-grounding every output in a validated clinical instrument (Section 3.3, citing ProKnow). Depression and anxiety have that instrument. Financial stress has an undergraduate-specific scale that exists but isn't remotely as universally recognized. "Career pressure" and "peer pressure" don't have anything close to PHQ-9's standing. Feeding ungrounded constructs into the same pipeline you built specifically to avoid ungrounded generation would be inconsistent with your own Section 2.4 argument.</w:t>
+        <w:t xml:space="preserve">There's no PHQ-9 for "peer pressure." Your generation layer's entire safety argument rests on RAG-grounding every output in a validated clinical instrument (Section 3.3, citing </w:t>
+      </w:r>
+      <w:proofErr w:type="spellStart"/>
+      <w:r>
+        <w:rPr>
+          <w:szCs w:val="24"/>
+        </w:rPr>
+        <w:t>ProKnow</w:t>
+      </w:r>
+      <w:proofErr w:type="spellEnd"/>
+      <w:r>
+        <w:rPr>
+          <w:szCs w:val="24"/>
+        </w:rPr>
+        <w:t>). Depression and anxiety have that instrument. Financial stress has an undergraduate-specific scale that exists but isn't remotely as universally recognized. "Career pressure" and "peer pressure" don't have anything close to PHQ-9's standing. Feeding ungrounded constructs into the same pipeline you built specifically to avoid ungrounded generation would be inconsistent with your own Section 2.4 argument.</w:t>
       </w:r>
     </w:p>
     <w:p>
@@ -794,7 +1169,21 @@
           <w:szCs w:val="24"/>
         </w:rPr>
         <w:lastRenderedPageBreak/>
-        <w:t xml:space="preserve">A version of this that might actually fit: don't feed these into Phase 2's automated ensemble or the RAG layer at all. Instead, make them optional, explicitly-entered context — the user types "money's been tight this semester" the way they'd tell a doctor — that surfaces only to the </w:t>
+        <w:t xml:space="preserve">A version of this that might actually fit: don't feed these into Phase 2's automated ensemble or the RAG layer at all. Instead, make them optional, explicitly-entered context — the user types "money's been tight this semester" the way they'd tell a doctor — </w:t>
+      </w:r>
+      <w:proofErr w:type="gramStart"/>
+      <w:r>
+        <w:rPr>
+          <w:szCs w:val="24"/>
+        </w:rPr>
+        <w:t>that surfaces</w:t>
+      </w:r>
+      <w:proofErr w:type="gramEnd"/>
+      <w:r>
+        <w:rPr>
+          <w:szCs w:val="24"/>
+        </w:rPr>
+        <w:t xml:space="preserve"> only to the </w:t>
       </w:r>
       <w:r>
         <w:rPr>
@@ -881,7 +1270,59 @@
         <w:rPr>
           <w:szCs w:val="24"/>
         </w:rPr>
-        <w:t>can fix , now think and talk about my two proposed additions , first one is decent</w:t>
+        <w:t xml:space="preserve">can </w:t>
+      </w:r>
+      <w:proofErr w:type="gramStart"/>
+      <w:r>
+        <w:rPr>
+          <w:szCs w:val="24"/>
+        </w:rPr>
+        <w:t>fix ,</w:t>
+      </w:r>
+      <w:proofErr w:type="gramEnd"/>
+      <w:r>
+        <w:rPr>
+          <w:szCs w:val="24"/>
+        </w:rPr>
+        <w:t xml:space="preserve"> now think</w:t>
+      </w:r>
+      <w:r>
+        <w:rPr>
+          <w:szCs w:val="24"/>
+        </w:rPr>
+        <w:t>ing</w:t>
+      </w:r>
+      <w:r>
+        <w:rPr>
+          <w:szCs w:val="24"/>
+        </w:rPr>
+        <w:t xml:space="preserve"> and talk</w:t>
+      </w:r>
+      <w:r>
+        <w:rPr>
+          <w:szCs w:val="24"/>
+        </w:rPr>
+        <w:t>ing</w:t>
+      </w:r>
+      <w:r>
+        <w:rPr>
+          <w:szCs w:val="24"/>
+        </w:rPr>
+        <w:t xml:space="preserve"> about my two proposed </w:t>
+      </w:r>
+      <w:proofErr w:type="gramStart"/>
+      <w:r>
+        <w:rPr>
+          <w:szCs w:val="24"/>
+        </w:rPr>
+        <w:t>additions ,</w:t>
+      </w:r>
+      <w:proofErr w:type="gramEnd"/>
+      <w:r>
+        <w:rPr>
+          <w:szCs w:val="24"/>
+        </w:rPr>
+        <w:t xml:space="preserve"> first one is decent</w:t>
       </w:r>
       <w:r>
         <w:rPr>
@@ -905,7 +1346,441 @@
         <w:rPr>
           <w:szCs w:val="24"/>
         </w:rPr>
-        <w:t xml:space="preserve"> as research paper says an automated feature of adding a best friend contact details and calling it when needed and before calling sending an automated message describing problem and whole situation . now the second of academic performance ,career pressure etc. for those i can work on academic stress ( i would provide a feature of uploading marks academic grades achievements etc in which user is comfortable) if user uploads than I can use that data also to get know about users condition make better estimate and provide better solution( from this i got an idea that in the message to friend or anyone I could also add the solutions which could be done to sooth the user as user is more close to contact, this will work better than TELEMANAS) and for financial and peer pressure standards I for now can't do much what can I do is — the user types "money's been tight this semester" , "placement needed soon " etc statements that would be gathered from keyboard of user or when user interacting with LLM for help , alongside the structured summary, never touching the automated detection or generation pipeline. That sidesteps all two problems: no institutional data pipeline (self-entered, on-device, optional), no self-report-replacing-passive-sensing claim (it's supplementary context for a human, not a machine-learning input), and no need for a validated instrument (a trained counsellor is interpreting it, not an algorithm). It's a smaller feature than what you described, but it's one that doesn't cost you the coherence you've built.</w:t>
+        <w:t xml:space="preserve"> as research paper says an automated feature of adding a best friend contact details and calling it when needed and before calling sending an automated message describing problem and whole </w:t>
+      </w:r>
+      <w:proofErr w:type="gramStart"/>
+      <w:r>
+        <w:rPr>
+          <w:szCs w:val="24"/>
+        </w:rPr>
+        <w:t>situation .</w:t>
+      </w:r>
+      <w:proofErr w:type="gramEnd"/>
+      <w:r>
+        <w:rPr>
+          <w:szCs w:val="24"/>
+        </w:rPr>
+        <w:t xml:space="preserve"> now the second of academic performance ,career pressure etc. for those </w:t>
+      </w:r>
+      <w:proofErr w:type="spellStart"/>
+      <w:r>
+        <w:rPr>
+          <w:szCs w:val="24"/>
+        </w:rPr>
+        <w:t>i</w:t>
+      </w:r>
+      <w:proofErr w:type="spellEnd"/>
+      <w:r>
+        <w:rPr>
+          <w:szCs w:val="24"/>
+        </w:rPr>
+        <w:t xml:space="preserve"> can work on academic stress ( </w:t>
+      </w:r>
+      <w:proofErr w:type="spellStart"/>
+      <w:r>
+        <w:rPr>
+          <w:szCs w:val="24"/>
+        </w:rPr>
+        <w:t>i</w:t>
+      </w:r>
+      <w:proofErr w:type="spellEnd"/>
+      <w:r>
+        <w:rPr>
+          <w:szCs w:val="24"/>
+        </w:rPr>
+        <w:t xml:space="preserve"> would provide a feature of uploading marks academic grades achievements etc in which user is comfortable) if user uploads than I can use that data also to get know about users condition make better estimate and provide better solution( from this </w:t>
+      </w:r>
+      <w:proofErr w:type="spellStart"/>
+      <w:r>
+        <w:rPr>
+          <w:szCs w:val="24"/>
+        </w:rPr>
+        <w:t>i</w:t>
+      </w:r>
+      <w:proofErr w:type="spellEnd"/>
+      <w:r>
+        <w:rPr>
+          <w:szCs w:val="24"/>
+        </w:rPr>
+        <w:t xml:space="preserve"> got an idea that in the message to friend or anyone I could also add the solutions which could be done to sooth the user as user is more close to contact, this will work better than TELEMANAS) and for financial and peer pressure standards I for now can't do much what can I do is — the user types "money's been tight this semester" , "placement needed soon " etc statements that would be gathered from keyboard of user or when user interacting with LLM for help , alongside the structured summary, never touching the automated detection or generation pipeline. That sidesteps all two problems: no institutional data pipeline (self-entered, on-device, optional), no self-report-replacing-passive-sensing claim (it's supplementary context for a human, not a machine-learning input), and no need for a validated instrument (a trained counsellor is interpreting it, not an algorithm). It's a smaller feature than what you described, but it's one that doesn't cost you the coherence you've built.</w:t>
+      </w:r>
+    </w:p>
+    <w:p>
+      <w:pPr>
+        <w:rPr>
+          <w:szCs w:val="24"/>
+        </w:rPr>
+      </w:pPr>
+    </w:p>
+    <w:p>
+      <w:pPr>
+        <w:rPr>
+          <w:szCs w:val="24"/>
+        </w:rPr>
+      </w:pPr>
+    </w:p>
+    <w:p>
+      <w:pPr>
+        <w:rPr>
+          <w:szCs w:val="24"/>
+        </w:rPr>
+      </w:pPr>
+    </w:p>
+    <w:p>
+      <w:pPr>
+        <w:rPr>
+          <w:szCs w:val="24"/>
+        </w:rPr>
+      </w:pPr>
+      <w:r>
+        <w:rPr>
+          <w:b/>
+          <w:bCs/>
+          <w:szCs w:val="24"/>
+        </w:rPr>
+        <w:lastRenderedPageBreak/>
+        <w:t>On "this will work better than Tele MANAS" — I want to push back on this directly, not soften it.</w:t>
+      </w:r>
+      <w:r>
+        <w:rPr>
+          <w:szCs w:val="24"/>
+        </w:rPr>
+        <w:t xml:space="preserve"> I looked at what the actual evidence-based standard for bystander response is: QPR (Question, Persuade, Refer), the most widely used gatekeeper-training model, SAMHSA-recognized, explicitly designed for people with no clinical background. Its own three steps end at </w:t>
+      </w:r>
+      <w:r>
+        <w:rPr>
+          <w:i/>
+          <w:iCs/>
+          <w:szCs w:val="24"/>
+        </w:rPr>
+        <w:t>Refer</w:t>
+      </w:r>
+      <w:r>
+        <w:rPr>
+          <w:szCs w:val="24"/>
+        </w:rPr>
+        <w:t xml:space="preserve"> — trained laypeople are taught to get the person to professional help, not to manage the crisis themselves. That's not a limitation of the model; it's the finding. Closeness helps someone notice something's wrong and get the person to reach out — it doesn't substitute for crisis-specific training, and QPR's own materials are explicit that this is "a citizen emergency response," not treatment. Your friend contact is genuinely valuable as a warmth-and-immediacy layer Tele MANAS structurally can't provide. It's not better at the thing Tele MANAS is actually for. I'd drop "better than Tele MANAS" from how you frame this in the paper — "complementary, faster to reach, not a substitute for trained response" is both more defensible and more accurate to what you're actually building.</w:t>
+      </w:r>
+    </w:p>
+    <w:p>
+      <w:pPr>
+        <w:rPr>
+          <w:szCs w:val="24"/>
+        </w:rPr>
+      </w:pPr>
+      <w:r>
+        <w:rPr>
+          <w:szCs w:val="24"/>
+        </w:rPr>
+        <w:t xml:space="preserve">That QPR finding also answers your "solutions to soothe" idea directly, and better than an ad hoc generation approach would: don't have Gemma freelance coping suggestions for an untrained person to deliver in a crisis — ground that content in the same Question-Persuade-Refer structure, the way your Tier 1 nudges are grounded in PHQ-9/GAD-7 rather than open generation. A friend told "ask directly, encourage them to call [number], stay with them" is following a validated protocol. A friend handed an AI's freshly-generated idea of what might help is exactly the unconstrained-generation risk your own </w:t>
+      </w:r>
+      <w:proofErr w:type="spellStart"/>
+      <w:r>
+        <w:rPr>
+          <w:szCs w:val="24"/>
+        </w:rPr>
+        <w:t>EmoGuard</w:t>
+      </w:r>
+      <w:proofErr w:type="spellEnd"/>
+      <w:r>
+        <w:rPr>
+          <w:szCs w:val="24"/>
+        </w:rPr>
+        <w:t xml:space="preserve"> section already exists to prevent — just aimed at a different reader.</w:t>
+      </w:r>
+    </w:p>
+    <w:p>
+      <w:pPr>
+        <w:rPr>
+          <w:b/>
+          <w:bCs/>
+          <w:szCs w:val="24"/>
+        </w:rPr>
+      </w:pPr>
+      <w:r>
+        <w:rPr>
+          <w:b/>
+          <w:bCs/>
+          <w:szCs w:val="24"/>
+        </w:rPr>
+        <w:t>Academic records</w:t>
+      </w:r>
+    </w:p>
+    <w:p>
+      <w:pPr>
+        <w:rPr>
+          <w:szCs w:val="24"/>
+        </w:rPr>
+      </w:pPr>
+      <w:r>
+        <w:rPr>
+          <w:szCs w:val="24"/>
+        </w:rPr>
+        <w:t>The self-upload fix is the right one, and it's worth being clear about exactly what it fixed: it solves the institutional-data-pipeline problem — no FERPA-style third-party relationship, no new attack surface, the user pulling their own data in is consistent with everything else Sentinel does. Good.</w:t>
+      </w:r>
+    </w:p>
+    <w:p>
+      <w:pPr>
+        <w:rPr>
+          <w:szCs w:val="24"/>
+        </w:rPr>
+      </w:pPr>
+      <w:r>
+        <w:rPr>
+          <w:szCs w:val="24"/>
+        </w:rPr>
+        <w:t xml:space="preserve">But that's a different problem from the one about validated instruments, and fixing the first doesn't fix the second. The question isn't "how does the data get in" anymore, it's "what do you let it </w:t>
+      </w:r>
+      <w:r>
+        <w:rPr>
+          <w:i/>
+          <w:iCs/>
+          <w:szCs w:val="24"/>
+        </w:rPr>
+        <w:t>do</w:t>
+      </w:r>
+      <w:r>
+        <w:rPr>
+          <w:szCs w:val="24"/>
+        </w:rPr>
+        <w:t xml:space="preserve"> once it's there." If uploaded grades feed the automated Phase 2 ensemble or shape RAG-grounded generation, you still need the thing PHQ-9/GAD-7 gives you for those pathways — a validated basis for treating a signal as diagnostically meaningful, not just "seems related." Grades are actually somewhat better off than career/peer pressure here — GPA decline does have real published correlation with student mental health, more than a vague construct like "peer pressure" does — but it's also a heavily confounded signal (a harder course, a different professor, a bad week, nothing to do with mental health at all), and nowhere near PHQ-9's specificity. My honest recommendation: keep it out of the automated ensemble for V4, use it the same way as the financial/peer statements — visible to a human reviewer at Tier 2/3, not a machine input — and if you want more than that, name it as a Stage 0 validation target the way you already do for the keystroke-capture </w:t>
+      </w:r>
+      <w:r>
+        <w:rPr>
+          <w:szCs w:val="24"/>
+        </w:rPr>
+        <w:lastRenderedPageBreak/>
+        <w:t>question in 3.2. That's not a brush-off; it's applying the exact staged-validation discipline that's already the strongest part of your methodology to a new signal, instead of grandfathering it in.</w:t>
+      </w:r>
+    </w:p>
+    <w:p>
+      <w:pPr>
+        <w:rPr>
+          <w:b/>
+          <w:bCs/>
+          <w:szCs w:val="24"/>
+        </w:rPr>
+      </w:pPr>
+      <w:r>
+        <w:rPr>
+          <w:b/>
+          <w:bCs/>
+          <w:szCs w:val="24"/>
+        </w:rPr>
+        <w:t>Financial/peer pressure via typed statements</w:t>
+      </w:r>
+    </w:p>
+    <w:p>
+      <w:pPr>
+        <w:rPr>
+          <w:szCs w:val="24"/>
+        </w:rPr>
+      </w:pPr>
+      <w:r>
+        <w:rPr>
+          <w:szCs w:val="24"/>
+        </w:rPr>
+        <w:t xml:space="preserve">The shape is right — this is what I'd suggested, and it holds up. One thing to lock down precisely before it goes in the paper: "gathered from keyboard of user" needs to mean </w:t>
+      </w:r>
+      <w:r>
+        <w:rPr>
+          <w:i/>
+          <w:iCs/>
+          <w:szCs w:val="24"/>
+        </w:rPr>
+        <w:t>Sentinel's own text fields only</w:t>
+      </w:r>
+      <w:r>
+        <w:rPr>
+          <w:szCs w:val="24"/>
+        </w:rPr>
+        <w:t>, same as everything else in Section 3.2. If it means capturing this anywhere the user types — that's the exact ambient-capture path Section 3.2 already rejected for keystroke dynamics, for the same IME/</w:t>
+      </w:r>
+      <w:proofErr w:type="spellStart"/>
+      <w:r>
+        <w:rPr>
+          <w:szCs w:val="24"/>
+        </w:rPr>
+        <w:t>AccessibilityService</w:t>
+      </w:r>
+      <w:proofErr w:type="spellEnd"/>
+      <w:r>
+        <w:rPr>
+          <w:szCs w:val="24"/>
+        </w:rPr>
+        <w:t xml:space="preserve"> reasons, and it would quietly reopen a door you spent a whole revision closing. I don't think that's what you meant, given "or when user interacting with LLM for help" right after — but say it explicitly in the text, the same way 3.2 does, so there's no room for it to drift.</w:t>
+      </w:r>
+    </w:p>
+    <w:p>
+      <w:pPr>
+        <w:rPr>
+          <w:szCs w:val="24"/>
+        </w:rPr>
+      </w:pPr>
+    </w:p>
+    <w:p>
+      <w:pPr>
+        <w:rPr>
+          <w:szCs w:val="24"/>
+        </w:rPr>
+      </w:pPr>
+    </w:p>
+    <w:p>
+      <w:pPr>
+        <w:rPr>
+          <w:b/>
+          <w:bCs/>
+          <w:szCs w:val="24"/>
+        </w:rPr>
+      </w:pPr>
+      <w:r>
+        <w:rPr>
+          <w:b/>
+          <w:bCs/>
+          <w:szCs w:val="24"/>
+        </w:rPr>
+        <w:t>HOW THE DESCRIBING TEXT WILL BE DELIVERED/GENERATED ETC.</w:t>
+      </w:r>
+    </w:p>
+    <w:p>
+      <w:pPr>
+        <w:rPr>
+          <w:szCs w:val="24"/>
+        </w:rPr>
+      </w:pPr>
+      <w:r>
+        <w:rPr>
+          <w:szCs w:val="24"/>
+        </w:rPr>
+        <w:t>Who and how it's generated: nobody, at trigger time — it's pre-written. Given everything we've worked through, the answer isn't "Gemma writes a description of the situation when Tier 3 fires." It's a small, fixed library of templates — 2 to 3 per trigger category — authored once, offline, reviewed with the same clinician-input discipline you already apply to the PHQ-9/GAD-7 lexicon in Section 3.3. At trigger time, the system does two things only: picks the right template based on which signal fired, and fills in the minimum variable content (the user's name as saved in the contact's phone, maybe a coarse tier label, the Tele MANAS number). No free text gets composed in the moment. This isn't a workaround — it's the exact same principle you've already applied everywhere else in the paper (constrain generation to pre-vetted content wherever the cost of being wrong is high), extended to the one channel that currently doesn't have it. And it has a real side benefit: because nothing is generated live, there's no new safety layer to design and validate for this channel — the safety work already happened once, at authoring time, the same way it did for the CBT-nudge lexicon.</w:t>
+      </w:r>
+    </w:p>
+    <w:p>
+      <w:pPr>
+        <w:rPr>
+          <w:szCs w:val="24"/>
+        </w:rPr>
+      </w:pPr>
+      <w:r>
+        <w:rPr>
+          <w:szCs w:val="24"/>
+        </w:rPr>
+        <w:t>This also means you need genuinely separate templates for self-harm risk vs. the harm-to-others case, not one generic "situation" template — a warm, supportive framing is right for one and wrong for the other, and conflating them risks the wrong tone landing on the wrong situation.</w:t>
+      </w:r>
+    </w:p>
+    <w:p>
+      <w:pPr>
+        <w:rPr>
+          <w:szCs w:val="24"/>
+        </w:rPr>
+      </w:pPr>
+      <w:r>
+        <w:rPr>
+          <w:szCs w:val="24"/>
+        </w:rPr>
+        <w:t xml:space="preserve">Content, concretely: keep it structural, not narrative. Something like — tier/category, not verbatim transcript; a direct instruction to act ("reach out to them now" / "encourage them to call [Tele MANAS number]"); and, worth adding, a resource </w:t>
+      </w:r>
+      <w:r>
+        <w:rPr>
+          <w:i/>
+          <w:iCs/>
+          <w:szCs w:val="24"/>
+        </w:rPr>
+        <w:t>for the friend themselves</w:t>
+      </w:r>
+      <w:r>
+        <w:rPr>
+          <w:szCs w:val="24"/>
+        </w:rPr>
+        <w:t xml:space="preserve"> — most crisis lines, Tele MANAS included, are set up to take calls from a worried contact just as </w:t>
+      </w:r>
+      <w:r>
+        <w:rPr>
+          <w:szCs w:val="24"/>
+        </w:rPr>
+        <w:lastRenderedPageBreak/>
+        <w:t xml:space="preserve">much as from the person at risk, and that's the actual evidence-based structure here: QPR (Question, Persuade, Refer), the standard gatekeeper-training model taught to laypeople with no clinical background, ends at </w:t>
+      </w:r>
+      <w:r>
+        <w:rPr>
+          <w:i/>
+          <w:iCs/>
+          <w:szCs w:val="24"/>
+        </w:rPr>
+        <w:t>refer</w:t>
+      </w:r>
+      <w:r>
+        <w:rPr>
+          <w:szCs w:val="24"/>
+        </w:rPr>
+        <w:t xml:space="preserve"> — it doesn't ask the friend to freelance a solution, it asks them to notice, encourage, and point toward professional help. A friend who gets "here's what's going on, and here's who to call if you're not sure what to do" is following that model. A friend who gets an AI-generated narrative with improvised coping suggestions isn't — that's the exact unconstrained-generation risk you've spent the whole paper designing against, just redirected at a different reader.</w:t>
+      </w:r>
+    </w:p>
+    <w:p>
+      <w:pPr>
+        <w:rPr>
+          <w:szCs w:val="24"/>
+        </w:rPr>
+      </w:pPr>
+      <w:r>
+        <w:rPr>
+          <w:szCs w:val="24"/>
+        </w:rPr>
+        <w:t xml:space="preserve">When: the templates are written at development time, same as your RAG lexicon. The one thing that should happen at </w:t>
+      </w:r>
+      <w:r>
+        <w:rPr>
+          <w:i/>
+          <w:iCs/>
+          <w:szCs w:val="24"/>
+        </w:rPr>
+        <w:t>setup</w:t>
+      </w:r>
+      <w:r>
+        <w:rPr>
+          <w:szCs w:val="24"/>
+        </w:rPr>
+        <w:t xml:space="preserve"> time, not trigger time, is showing the user the literal message their contact would receive, before they confirm that contact — this is what actually satisfies Section 5.5's consent-specificity commitment. "I agree to have my friend contacted" and "I agree to this exact message being sent" are different levels of consent, and previewing it at setup is what closes that gap.</w:t>
+      </w:r>
+    </w:p>
+    <w:p>
+      <w:pPr>
+        <w:rPr>
+          <w:szCs w:val="24"/>
+        </w:rPr>
+      </w:pPr>
+      <w:r>
+        <w:rPr>
+          <w:szCs w:val="24"/>
+        </w:rPr>
+        <w:t>Delivery: default to text, not an automated call — for the reasons we already covered (reliability, and a synthesized voice describing a mental health crisis reads as spam more often than not). If a call matters to you, don't make it autonomous: reuse the pattern your own Table 1 already uses for Tele MANAS at Tier 2 — "one-tap connection." The text carries a one-tap call action, so a human decides to place the call, rather than Sentinel placing an unsupervised one. And functionally, you don't need retry-if-unanswered logic layered on top of this: Tele MANAS surfacing to the user already fires immediately and unconditionally at Tier 3 regardless of what the friend does with the text, so the friend channel is additive safety, not the only safety, which means its reliability isn't a single point of failure. Building in automatic escalation-if-no-response would also start drifting back toward the automated-dispatch pattern Section 3.5 already rules out on principle.</w:t>
+      </w:r>
+    </w:p>
+    <w:p>
+      <w:pPr>
+        <w:rPr>
+          <w:szCs w:val="24"/>
+        </w:rPr>
+      </w:pPr>
+      <w:r>
+        <w:rPr>
+          <w:szCs w:val="24"/>
+        </w:rPr>
+        <w:t xml:space="preserve">One </w:t>
+      </w:r>
+      <w:proofErr w:type="gramStart"/>
+      <w:r>
+        <w:rPr>
+          <w:szCs w:val="24"/>
+        </w:rPr>
+        <w:t>reframe</w:t>
+      </w:r>
+      <w:proofErr w:type="gramEnd"/>
+      <w:r>
+        <w:rPr>
+          <w:szCs w:val="24"/>
+        </w:rPr>
+        <w:t xml:space="preserve"> worth noting for how you write this into the paper: Table 1's Tier 3 row already has "optionally, with prior consent, an encrypted context message to a pre-designated contact" — what we've just designed is the actual content and mechanics of that existing row, not a new one. Smaller change to document than it might have felt like</w:t>
       </w:r>
     </w:p>
     <w:p>

</xml_diff>

<commit_message>
gap found ,reviewing v3
</commit_message>
<xml_diff>
--- a/Problems in V3 and new functionality proposition.docx
+++ b/Problems in V3 and new functionality proposition.docx
@@ -11,7 +11,6 @@
           <w:szCs w:val="32"/>
         </w:rPr>
       </w:pPr>
-      <w:proofErr w:type="spellStart"/>
       <w:r>
         <w:rPr>
           <w:b/>
@@ -19,26 +18,7 @@
           <w:sz w:val="32"/>
           <w:szCs w:val="32"/>
         </w:rPr>
-        <w:t>o</w:t>
-      </w:r>
-      <w:r>
-        <w:rPr>
-          <w:b/>
-          <w:bCs/>
-          <w:sz w:val="32"/>
-          <w:szCs w:val="32"/>
-        </w:rPr>
-        <w:t>Problems</w:t>
-      </w:r>
-      <w:proofErr w:type="spellEnd"/>
-      <w:r>
-        <w:rPr>
-          <w:b/>
-          <w:bCs/>
-          <w:sz w:val="32"/>
-          <w:szCs w:val="32"/>
-        </w:rPr>
-        <w:t xml:space="preserve"> in V3 according to </w:t>
+        <w:t xml:space="preserve">Problems in V3 according to </w:t>
       </w:r>
       <w:proofErr w:type="spellStart"/>
       <w:r>
@@ -2831,6 +2811,7 @@
   <w:style w:type="character" w:default="1" w:styleId="DefaultParagraphFont">
     <w:name w:val="Default Paragraph Font"/>
     <w:uiPriority w:val="1"/>
+    <w:semiHidden/>
     <w:unhideWhenUsed/>
   </w:style>
   <w:style w:type="table" w:default="1" w:styleId="TableNormal">

</xml_diff>